<commit_message>
feat: add structural anchoring, LicenseCheck project, theme-adaptive UI, tests & update knowledge base
- 新增 structural_anchoring.py 结构锚定模块
- 新增 LicenseCheck .NET 项目（Aspose 许可证验证）
- Web 界面从深色模式升级为自适应主题（支持深色/浅色切换）
- 新增 tests/ 测试目录（test_phase2_context, test_phase3_prompt, test_merged_table）
- 更新 README 中英文文档
- 更新 requirements.txt
- 更新知识库（新增复杂.docx、江西省知识库.docx、班级表2.docx）
- 更新模板文件（班级表.docx、空白复杂表格.docx）
- 移除旧的生成文件
- 新增 .gitignore 排除缓存、构建产物和生成文件
- 从 git 追踪中移除 __pycache__ 目录
</commit_message>
<xml_diff>
--- a/模版/班级表.docx
+++ b/模版/班级表.docx
@@ -17,7 +17,9 @@
         </w:tblBorders>
         <w:tblLayout w:type="autofit"/>
         <w:tblCellMar>
+          <w:top w:w="0" w:type="dxa"/>
           <w:left w:w="108" w:type="dxa"/>
+          <w:bottom w:w="0" w:type="dxa"/>
           <w:right w:w="108" w:type="dxa"/>
         </w:tblCellMar>
       </w:tblPr>
@@ -38,7 +40,9 @@
             <w:insideV w:val="single" w:color="auto" w:sz="4" w:space="0"/>
           </w:tblBorders>
           <w:tblCellMar>
+            <w:top w:w="0" w:type="dxa"/>
             <w:left w:w="108" w:type="dxa"/>
+            <w:bottom w:w="0" w:type="dxa"/>
             <w:right w:w="108" w:type="dxa"/>
           </w:tblCellMar>
         </w:tblPrEx>
@@ -49,14 +53,18 @@
           <w:p>
             <w:pPr>
               <w:rPr>
-                <w:rFonts w:hint="eastAsia" w:eastAsiaTheme="minorEastAsia"/>
+                <w:rFonts w:hint="eastAsia" w:ascii="楷体" w:hAnsi="楷体" w:eastAsia="楷体" w:cs="楷体"/>
+                <w:sz w:val="48"/>
+                <w:szCs w:val="48"/>
                 <w:vertAlign w:val="baseline"/>
                 <w:lang w:val="en-US" w:eastAsia="zh-CN"/>
               </w:rPr>
             </w:pPr>
             <w:r>
               <w:rPr>
-                <w:rFonts w:hint="eastAsia"/>
+                <w:rFonts w:hint="eastAsia" w:ascii="楷体" w:hAnsi="楷体" w:eastAsia="楷体" w:cs="楷体"/>
+                <w:sz w:val="48"/>
+                <w:szCs w:val="48"/>
                 <w:vertAlign w:val="baseline"/>
                 <w:lang w:val="en-US" w:eastAsia="zh-CN"/>
               </w:rPr>
@@ -71,14 +79,20 @@
           <w:p>
             <w:pPr>
               <w:rPr>
-                <w:rFonts w:hint="eastAsia" w:eastAsiaTheme="minorEastAsia"/>
+                <w:rFonts w:hint="eastAsia" w:ascii="楷体" w:hAnsi="楷体" w:eastAsia="楷体" w:cs="楷体"/>
+                <w:sz w:val="48"/>
+                <w:szCs w:val="48"/>
                 <w:vertAlign w:val="baseline"/>
                 <w:lang w:val="en-US" w:eastAsia="zh-CN"/>
               </w:rPr>
             </w:pPr>
             <w:r>
               <w:rPr>
-                <w:rFonts w:hint="eastAsia"/>
+                <w:rFonts w:hint="eastAsia" w:ascii="楷体" w:hAnsi="楷体" w:eastAsia="楷体" w:cs="楷体"/>
+                <w:b/>
+                <w:bCs/>
+                <w:sz w:val="48"/>
+                <w:szCs w:val="48"/>
                 <w:vertAlign w:val="baseline"/>
                 <w:lang w:val="en-US" w:eastAsia="zh-CN"/>
               </w:rPr>
@@ -93,14 +107,20 @@
           <w:p>
             <w:pPr>
               <w:rPr>
-                <w:rFonts w:hint="eastAsia" w:eastAsiaTheme="minorEastAsia"/>
+                <w:rFonts w:hint="eastAsia" w:ascii="楷体" w:hAnsi="楷体" w:eastAsia="楷体" w:cs="楷体"/>
+                <w:sz w:val="48"/>
+                <w:szCs w:val="48"/>
                 <w:vertAlign w:val="baseline"/>
                 <w:lang w:val="en-US" w:eastAsia="zh-CN"/>
               </w:rPr>
             </w:pPr>
             <w:r>
               <w:rPr>
-                <w:rFonts w:hint="eastAsia"/>
+                <w:rFonts w:hint="eastAsia" w:ascii="楷体" w:hAnsi="楷体" w:eastAsia="楷体" w:cs="楷体"/>
+                <w:i/>
+                <w:iCs/>
+                <w:sz w:val="48"/>
+                <w:szCs w:val="48"/>
                 <w:vertAlign w:val="baseline"/>
                 <w:lang w:val="en-US" w:eastAsia="zh-CN"/>
               </w:rPr>
@@ -115,16 +135,26 @@
           <w:p>
             <w:pPr>
               <w:rPr>
-                <w:rFonts w:hint="default"/>
+                <w:rFonts w:hint="eastAsia" w:ascii="楷体" w:hAnsi="楷体" w:eastAsia="楷体" w:cs="楷体"/>
+                <w:sz w:val="48"/>
+                <w:szCs w:val="48"/>
                 <w:vertAlign w:val="baseline"/>
                 <w:lang w:val="en-US" w:eastAsia="zh-CN"/>
               </w:rPr>
             </w:pPr>
             <w:r>
               <w:rPr>
-                <w:rFonts w:hint="eastAsia"/>
+                <w:rFonts w:hint="eastAsia" w:ascii="楷体" w:hAnsi="楷体" w:eastAsia="楷体" w:cs="楷体"/>
+                <w:color w:val="E54C5E" w:themeColor="accent6"/>
+                <w:sz w:val="48"/>
+                <w:szCs w:val="48"/>
                 <w:vertAlign w:val="baseline"/>
                 <w:lang w:val="en-US" w:eastAsia="zh-CN"/>
+                <w14:textFill>
+                  <w14:solidFill>
+                    <w14:schemeClr w14:val="accent6"/>
+                  </w14:solidFill>
+                </w14:textFill>
               </w:rPr>
               <w:t>特长</w:t>
             </w:r>
@@ -142,7 +172,9 @@
             <w:insideV w:val="single" w:color="auto" w:sz="4" w:space="0"/>
           </w:tblBorders>
           <w:tblCellMar>
+            <w:top w:w="0" w:type="dxa"/>
             <w:left w:w="108" w:type="dxa"/>
+            <w:bottom w:w="0" w:type="dxa"/>
             <w:right w:w="108" w:type="dxa"/>
           </w:tblCellMar>
         </w:tblPrEx>
@@ -153,42 +185,56 @@
           <w:p>
             <w:pPr>
               <w:rPr>
-                <w:vertAlign w:val="baseline"/>
-              </w:rPr>
-            </w:pPr>
-          </w:p>
-        </w:tc>
-        <w:tc>
-          <w:tcPr>
-            <w:tcW w:w="2130" w:type="dxa"/>
-          </w:tcPr>
-          <w:p>
-            <w:pPr>
-              <w:rPr>
-                <w:vertAlign w:val="baseline"/>
-              </w:rPr>
-            </w:pPr>
-          </w:p>
-        </w:tc>
-        <w:tc>
-          <w:tcPr>
-            <w:tcW w:w="2130" w:type="dxa"/>
-          </w:tcPr>
-          <w:p>
-            <w:pPr>
-              <w:rPr>
-                <w:vertAlign w:val="baseline"/>
-              </w:rPr>
-            </w:pPr>
-          </w:p>
-        </w:tc>
-        <w:tc>
-          <w:tcPr>
-            <w:tcW w:w="2130" w:type="dxa"/>
-          </w:tcPr>
-          <w:p>
-            <w:pPr>
-              <w:rPr>
+                <w:rFonts w:hint="eastAsia" w:ascii="新宋体" w:hAnsi="新宋体" w:eastAsia="新宋体" w:cs="新宋体"/>
+                <w:sz w:val="10"/>
+                <w:szCs w:val="10"/>
+                <w:vertAlign w:val="baseline"/>
+              </w:rPr>
+            </w:pPr>
+          </w:p>
+        </w:tc>
+        <w:tc>
+          <w:tcPr>
+            <w:tcW w:w="2130" w:type="dxa"/>
+          </w:tcPr>
+          <w:p>
+            <w:pPr>
+              <w:rPr>
+                <w:rFonts w:hint="default" w:ascii="Arial" w:hAnsi="Arial" w:cs="Arial"/>
+                <w:sz w:val="15"/>
+                <w:szCs w:val="15"/>
+                <w:vertAlign w:val="baseline"/>
+              </w:rPr>
+            </w:pPr>
+          </w:p>
+        </w:tc>
+        <w:tc>
+          <w:tcPr>
+            <w:tcW w:w="2130" w:type="dxa"/>
+          </w:tcPr>
+          <w:p>
+            <w:pPr>
+              <w:rPr>
+                <w:rFonts w:hint="eastAsia" w:ascii="微软雅黑" w:hAnsi="微软雅黑" w:eastAsia="微软雅黑" w:cs="微软雅黑"/>
+                <w:sz w:val="15"/>
+                <w:szCs w:val="15"/>
+                <w:vertAlign w:val="baseline"/>
+              </w:rPr>
+            </w:pPr>
+            <w:bookmarkStart w:id="0" w:name="_GoBack"/>
+            <w:bookmarkEnd w:id="0"/>
+          </w:p>
+        </w:tc>
+        <w:tc>
+          <w:tcPr>
+            <w:tcW w:w="2130" w:type="dxa"/>
+          </w:tcPr>
+          <w:p>
+            <w:pPr>
+              <w:rPr>
+                <w:rFonts w:hint="default" w:ascii="Arial" w:hAnsi="Arial" w:cs="Arial"/>
+                <w:sz w:val="15"/>
+                <w:szCs w:val="15"/>
                 <w:vertAlign w:val="baseline"/>
               </w:rPr>
             </w:pPr>
@@ -206,7 +252,9 @@
             <w:insideV w:val="single" w:color="auto" w:sz="4" w:space="0"/>
           </w:tblBorders>
           <w:tblCellMar>
+            <w:top w:w="0" w:type="dxa"/>
             <w:left w:w="108" w:type="dxa"/>
+            <w:bottom w:w="0" w:type="dxa"/>
             <w:right w:w="108" w:type="dxa"/>
           </w:tblCellMar>
         </w:tblPrEx>
@@ -217,42 +265,54 @@
           <w:p>
             <w:pPr>
               <w:rPr>
-                <w:vertAlign w:val="baseline"/>
-              </w:rPr>
-            </w:pPr>
-          </w:p>
-        </w:tc>
-        <w:tc>
-          <w:tcPr>
-            <w:tcW w:w="2130" w:type="dxa"/>
-          </w:tcPr>
-          <w:p>
-            <w:pPr>
-              <w:rPr>
-                <w:vertAlign w:val="baseline"/>
-              </w:rPr>
-            </w:pPr>
-          </w:p>
-        </w:tc>
-        <w:tc>
-          <w:tcPr>
-            <w:tcW w:w="2130" w:type="dxa"/>
-          </w:tcPr>
-          <w:p>
-            <w:pPr>
-              <w:rPr>
-                <w:vertAlign w:val="baseline"/>
-              </w:rPr>
-            </w:pPr>
-          </w:p>
-        </w:tc>
-        <w:tc>
-          <w:tcPr>
-            <w:tcW w:w="2130" w:type="dxa"/>
-          </w:tcPr>
-          <w:p>
-            <w:pPr>
-              <w:rPr>
+                <w:rFonts w:hint="default" w:ascii="Arial" w:hAnsi="Arial" w:cs="Arial"/>
+                <w:sz w:val="28"/>
+                <w:szCs w:val="28"/>
+                <w:vertAlign w:val="baseline"/>
+              </w:rPr>
+            </w:pPr>
+          </w:p>
+        </w:tc>
+        <w:tc>
+          <w:tcPr>
+            <w:tcW w:w="2130" w:type="dxa"/>
+          </w:tcPr>
+          <w:p>
+            <w:pPr>
+              <w:rPr>
+                <w:rFonts w:hint="default" w:ascii="Arial" w:hAnsi="Arial" w:cs="Arial"/>
+                <w:sz w:val="15"/>
+                <w:szCs w:val="15"/>
+                <w:vertAlign w:val="baseline"/>
+              </w:rPr>
+            </w:pPr>
+          </w:p>
+        </w:tc>
+        <w:tc>
+          <w:tcPr>
+            <w:tcW w:w="2130" w:type="dxa"/>
+          </w:tcPr>
+          <w:p>
+            <w:pPr>
+              <w:rPr>
+                <w:rFonts w:hint="default" w:ascii="Arial" w:hAnsi="Arial" w:cs="Arial"/>
+                <w:sz w:val="15"/>
+                <w:szCs w:val="15"/>
+                <w:vertAlign w:val="baseline"/>
+              </w:rPr>
+            </w:pPr>
+          </w:p>
+        </w:tc>
+        <w:tc>
+          <w:tcPr>
+            <w:tcW w:w="2130" w:type="dxa"/>
+          </w:tcPr>
+          <w:p>
+            <w:pPr>
+              <w:rPr>
+                <w:rFonts w:hint="default" w:ascii="Arial" w:hAnsi="Arial" w:cs="Arial"/>
+                <w:sz w:val="15"/>
+                <w:szCs w:val="15"/>
                 <w:vertAlign w:val="baseline"/>
               </w:rPr>
             </w:pPr>
@@ -270,7 +330,9 @@
             <w:insideV w:val="single" w:color="auto" w:sz="4" w:space="0"/>
           </w:tblBorders>
           <w:tblCellMar>
+            <w:top w:w="0" w:type="dxa"/>
             <w:left w:w="108" w:type="dxa"/>
+            <w:bottom w:w="0" w:type="dxa"/>
             <w:right w:w="108" w:type="dxa"/>
           </w:tblCellMar>
         </w:tblPrEx>
@@ -281,222 +343,54 @@
           <w:p>
             <w:pPr>
               <w:rPr>
-                <w:vertAlign w:val="baseline"/>
-              </w:rPr>
-            </w:pPr>
-          </w:p>
-        </w:tc>
-        <w:tc>
-          <w:tcPr>
-            <w:tcW w:w="2130" w:type="dxa"/>
-          </w:tcPr>
-          <w:p>
-            <w:pPr>
-              <w:rPr>
-                <w:vertAlign w:val="baseline"/>
-              </w:rPr>
-            </w:pPr>
-          </w:p>
-        </w:tc>
-        <w:tc>
-          <w:tcPr>
-            <w:tcW w:w="2130" w:type="dxa"/>
-          </w:tcPr>
-          <w:p>
-            <w:pPr>
-              <w:rPr>
-                <w:vertAlign w:val="baseline"/>
-              </w:rPr>
-            </w:pPr>
-          </w:p>
-        </w:tc>
-        <w:tc>
-          <w:tcPr>
-            <w:tcW w:w="2130" w:type="dxa"/>
-          </w:tcPr>
-          <w:p>
-            <w:pPr>
-              <w:rPr>
-                <w:vertAlign w:val="baseline"/>
-              </w:rPr>
-            </w:pPr>
-          </w:p>
-        </w:tc>
-      </w:tr>
-      <w:tr>
-        <w:tblPrEx>
-          <w:tblBorders>
-            <w:top w:val="single" w:color="auto" w:sz="4" w:space="0"/>
-            <w:left w:val="single" w:color="auto" w:sz="4" w:space="0"/>
-            <w:bottom w:val="single" w:color="auto" w:sz="4" w:space="0"/>
-            <w:right w:val="single" w:color="auto" w:sz="4" w:space="0"/>
-            <w:insideH w:val="single" w:color="auto" w:sz="4" w:space="0"/>
-            <w:insideV w:val="single" w:color="auto" w:sz="4" w:space="0"/>
-          </w:tblBorders>
-        </w:tblPrEx>
-        <w:tc>
-          <w:tcPr>
-            <w:tcW w:w="2129" w:type="dxa"/>
-          </w:tcPr>
-          <w:p>
-            <w:pPr>
-              <w:rPr>
-                <w:vertAlign w:val="baseline"/>
-              </w:rPr>
-            </w:pPr>
-          </w:p>
-        </w:tc>
-        <w:tc>
-          <w:tcPr>
-            <w:tcW w:w="2130" w:type="dxa"/>
-          </w:tcPr>
-          <w:p>
-            <w:pPr>
-              <w:rPr>
-                <w:vertAlign w:val="baseline"/>
-              </w:rPr>
-            </w:pPr>
-          </w:p>
-        </w:tc>
-        <w:tc>
-          <w:tcPr>
-            <w:tcW w:w="2130" w:type="dxa"/>
-          </w:tcPr>
-          <w:p>
-            <w:pPr>
-              <w:rPr>
-                <w:vertAlign w:val="baseline"/>
-              </w:rPr>
-            </w:pPr>
-          </w:p>
-        </w:tc>
-        <w:tc>
-          <w:tcPr>
-            <w:tcW w:w="2130" w:type="dxa"/>
-          </w:tcPr>
-          <w:p>
-            <w:pPr>
-              <w:rPr>
-                <w:vertAlign w:val="baseline"/>
-              </w:rPr>
-            </w:pPr>
-          </w:p>
-        </w:tc>
-      </w:tr>
-      <w:tr>
-        <w:tblPrEx>
-          <w:tblBorders>
-            <w:top w:val="single" w:color="auto" w:sz="4" w:space="0"/>
-            <w:left w:val="single" w:color="auto" w:sz="4" w:space="0"/>
-            <w:bottom w:val="single" w:color="auto" w:sz="4" w:space="0"/>
-            <w:right w:val="single" w:color="auto" w:sz="4" w:space="0"/>
-            <w:insideH w:val="single" w:color="auto" w:sz="4" w:space="0"/>
-            <w:insideV w:val="single" w:color="auto" w:sz="4" w:space="0"/>
-          </w:tblBorders>
-        </w:tblPrEx>
-        <w:tc>
-          <w:tcPr>
-            <w:tcW w:w="2129" w:type="dxa"/>
-          </w:tcPr>
-          <w:p>
-            <w:pPr>
-              <w:rPr>
-                <w:vertAlign w:val="baseline"/>
-              </w:rPr>
-            </w:pPr>
-          </w:p>
-        </w:tc>
-        <w:tc>
-          <w:tcPr>
-            <w:tcW w:w="2130" w:type="dxa"/>
-          </w:tcPr>
-          <w:p>
-            <w:pPr>
-              <w:rPr>
-                <w:vertAlign w:val="baseline"/>
-              </w:rPr>
-            </w:pPr>
-          </w:p>
-        </w:tc>
-        <w:tc>
-          <w:tcPr>
-            <w:tcW w:w="2130" w:type="dxa"/>
-          </w:tcPr>
-          <w:p>
-            <w:pPr>
-              <w:rPr>
-                <w:vertAlign w:val="baseline"/>
-              </w:rPr>
-            </w:pPr>
-          </w:p>
-        </w:tc>
-        <w:tc>
-          <w:tcPr>
-            <w:tcW w:w="2130" w:type="dxa"/>
-          </w:tcPr>
-          <w:p>
-            <w:pPr>
-              <w:rPr>
-                <w:vertAlign w:val="baseline"/>
-              </w:rPr>
-            </w:pPr>
-          </w:p>
-        </w:tc>
-      </w:tr>
-      <w:tr>
-        <w:tblPrEx>
-          <w:tblBorders>
-            <w:top w:val="single" w:color="auto" w:sz="4" w:space="0"/>
-            <w:left w:val="single" w:color="auto" w:sz="4" w:space="0"/>
-            <w:bottom w:val="single" w:color="auto" w:sz="4" w:space="0"/>
-            <w:right w:val="single" w:color="auto" w:sz="4" w:space="0"/>
-            <w:insideH w:val="single" w:color="auto" w:sz="4" w:space="0"/>
-            <w:insideV w:val="single" w:color="auto" w:sz="4" w:space="0"/>
-          </w:tblBorders>
-        </w:tblPrEx>
-        <w:tc>
-          <w:tcPr>
-            <w:tcW w:w="2129" w:type="dxa"/>
-          </w:tcPr>
-          <w:p>
-            <w:pPr>
-              <w:rPr>
-                <w:vertAlign w:val="baseline"/>
-              </w:rPr>
-            </w:pPr>
-          </w:p>
-        </w:tc>
-        <w:tc>
-          <w:tcPr>
-            <w:tcW w:w="2130" w:type="dxa"/>
-          </w:tcPr>
-          <w:p>
-            <w:pPr>
-              <w:rPr>
-                <w:vertAlign w:val="baseline"/>
-              </w:rPr>
-            </w:pPr>
-          </w:p>
-        </w:tc>
-        <w:tc>
-          <w:tcPr>
-            <w:tcW w:w="2130" w:type="dxa"/>
-          </w:tcPr>
-          <w:p>
-            <w:pPr>
-              <w:rPr>
-                <w:vertAlign w:val="baseline"/>
-              </w:rPr>
-            </w:pPr>
-          </w:p>
-        </w:tc>
-        <w:tc>
-          <w:tcPr>
-            <w:tcW w:w="2130" w:type="dxa"/>
-          </w:tcPr>
-          <w:p>
-            <w:pPr>
-              <w:rPr>
+                <w:rFonts w:hint="default" w:ascii="Arial" w:hAnsi="Arial" w:cs="Arial"/>
+                <w:sz w:val="20"/>
+                <w:szCs w:val="20"/>
+                <w:vertAlign w:val="baseline"/>
+              </w:rPr>
+            </w:pPr>
+          </w:p>
+        </w:tc>
+        <w:tc>
+          <w:tcPr>
+            <w:tcW w:w="2130" w:type="dxa"/>
+          </w:tcPr>
+          <w:p>
+            <w:pPr>
+              <w:rPr>
+                <w:rFonts w:hint="default" w:ascii="Arial" w:hAnsi="Arial" w:cs="Arial"/>
+                <w:sz w:val="15"/>
+                <w:szCs w:val="15"/>
+                <w:vertAlign w:val="baseline"/>
+              </w:rPr>
+            </w:pPr>
+          </w:p>
+        </w:tc>
+        <w:tc>
+          <w:tcPr>
+            <w:tcW w:w="2130" w:type="dxa"/>
+          </w:tcPr>
+          <w:p>
+            <w:pPr>
+              <w:rPr>
+                <w:rFonts w:hint="default" w:ascii="Arial" w:hAnsi="Arial" w:cs="Arial"/>
+                <w:sz w:val="15"/>
+                <w:szCs w:val="15"/>
+                <w:vertAlign w:val="baseline"/>
+              </w:rPr>
+            </w:pPr>
+          </w:p>
+        </w:tc>
+        <w:tc>
+          <w:tcPr>
+            <w:tcW w:w="2130" w:type="dxa"/>
+          </w:tcPr>
+          <w:p>
+            <w:pPr>
+              <w:rPr>
+                <w:rFonts w:hint="default" w:ascii="Arial" w:hAnsi="Arial" w:cs="Arial"/>
+                <w:sz w:val="15"/>
+                <w:szCs w:val="15"/>
                 <w:vertAlign w:val="baseline"/>
               </w:rPr>
             </w:pPr>
@@ -514,7 +408,9 @@
             <w:insideV w:val="single" w:color="auto" w:sz="4" w:space="0"/>
           </w:tblBorders>
           <w:tblCellMar>
+            <w:top w:w="0" w:type="dxa"/>
             <w:left w:w="108" w:type="dxa"/>
+            <w:bottom w:w="0" w:type="dxa"/>
             <w:right w:w="108" w:type="dxa"/>
           </w:tblCellMar>
         </w:tblPrEx>
@@ -525,42 +421,288 @@
           <w:p>
             <w:pPr>
               <w:rPr>
-                <w:vertAlign w:val="baseline"/>
-              </w:rPr>
-            </w:pPr>
-          </w:p>
-        </w:tc>
-        <w:tc>
-          <w:tcPr>
-            <w:tcW w:w="2130" w:type="dxa"/>
-          </w:tcPr>
-          <w:p>
-            <w:pPr>
-              <w:rPr>
-                <w:vertAlign w:val="baseline"/>
-              </w:rPr>
-            </w:pPr>
-          </w:p>
-        </w:tc>
-        <w:tc>
-          <w:tcPr>
-            <w:tcW w:w="2130" w:type="dxa"/>
-          </w:tcPr>
-          <w:p>
-            <w:pPr>
-              <w:rPr>
-                <w:vertAlign w:val="baseline"/>
-              </w:rPr>
-            </w:pPr>
-          </w:p>
-        </w:tc>
-        <w:tc>
-          <w:tcPr>
-            <w:tcW w:w="2130" w:type="dxa"/>
-          </w:tcPr>
-          <w:p>
-            <w:pPr>
-              <w:rPr>
+                <w:rFonts w:hint="default" w:ascii="Arial" w:hAnsi="Arial" w:cs="Arial"/>
+                <w:sz w:val="15"/>
+                <w:szCs w:val="15"/>
+                <w:vertAlign w:val="baseline"/>
+              </w:rPr>
+            </w:pPr>
+          </w:p>
+        </w:tc>
+        <w:tc>
+          <w:tcPr>
+            <w:tcW w:w="2130" w:type="dxa"/>
+          </w:tcPr>
+          <w:p>
+            <w:pPr>
+              <w:rPr>
+                <w:rFonts w:hint="default" w:ascii="Arial" w:hAnsi="Arial" w:cs="Arial"/>
+                <w:sz w:val="15"/>
+                <w:szCs w:val="15"/>
+                <w:vertAlign w:val="baseline"/>
+              </w:rPr>
+            </w:pPr>
+          </w:p>
+        </w:tc>
+        <w:tc>
+          <w:tcPr>
+            <w:tcW w:w="2130" w:type="dxa"/>
+          </w:tcPr>
+          <w:p>
+            <w:pPr>
+              <w:rPr>
+                <w:rFonts w:hint="default" w:ascii="Arial" w:hAnsi="Arial" w:cs="Arial"/>
+                <w:sz w:val="15"/>
+                <w:szCs w:val="15"/>
+                <w:vertAlign w:val="baseline"/>
+              </w:rPr>
+            </w:pPr>
+          </w:p>
+        </w:tc>
+        <w:tc>
+          <w:tcPr>
+            <w:tcW w:w="2130" w:type="dxa"/>
+          </w:tcPr>
+          <w:p>
+            <w:pPr>
+              <w:rPr>
+                <w:rFonts w:hint="default" w:ascii="Arial" w:hAnsi="Arial" w:cs="Arial"/>
+                <w:sz w:val="15"/>
+                <w:szCs w:val="15"/>
+                <w:vertAlign w:val="baseline"/>
+              </w:rPr>
+            </w:pPr>
+          </w:p>
+        </w:tc>
+      </w:tr>
+      <w:tr>
+        <w:tblPrEx>
+          <w:tblBorders>
+            <w:top w:val="single" w:color="auto" w:sz="4" w:space="0"/>
+            <w:left w:val="single" w:color="auto" w:sz="4" w:space="0"/>
+            <w:bottom w:val="single" w:color="auto" w:sz="4" w:space="0"/>
+            <w:right w:val="single" w:color="auto" w:sz="4" w:space="0"/>
+            <w:insideH w:val="single" w:color="auto" w:sz="4" w:space="0"/>
+            <w:insideV w:val="single" w:color="auto" w:sz="4" w:space="0"/>
+          </w:tblBorders>
+          <w:tblCellMar>
+            <w:top w:w="0" w:type="dxa"/>
+            <w:left w:w="108" w:type="dxa"/>
+            <w:bottom w:w="0" w:type="dxa"/>
+            <w:right w:w="108" w:type="dxa"/>
+          </w:tblCellMar>
+        </w:tblPrEx>
+        <w:tc>
+          <w:tcPr>
+            <w:tcW w:w="2129" w:type="dxa"/>
+          </w:tcPr>
+          <w:p>
+            <w:pPr>
+              <w:rPr>
+                <w:rFonts w:hint="default" w:ascii="Arial" w:hAnsi="Arial" w:cs="Arial"/>
+                <w:sz w:val="15"/>
+                <w:szCs w:val="15"/>
+                <w:vertAlign w:val="baseline"/>
+              </w:rPr>
+            </w:pPr>
+          </w:p>
+        </w:tc>
+        <w:tc>
+          <w:tcPr>
+            <w:tcW w:w="2130" w:type="dxa"/>
+          </w:tcPr>
+          <w:p>
+            <w:pPr>
+              <w:rPr>
+                <w:rFonts w:hint="default" w:ascii="Arial" w:hAnsi="Arial" w:cs="Arial"/>
+                <w:sz w:val="15"/>
+                <w:szCs w:val="15"/>
+                <w:vertAlign w:val="baseline"/>
+              </w:rPr>
+            </w:pPr>
+          </w:p>
+        </w:tc>
+        <w:tc>
+          <w:tcPr>
+            <w:tcW w:w="2130" w:type="dxa"/>
+          </w:tcPr>
+          <w:p>
+            <w:pPr>
+              <w:rPr>
+                <w:rFonts w:hint="default" w:ascii="Arial" w:hAnsi="Arial" w:cs="Arial"/>
+                <w:sz w:val="15"/>
+                <w:szCs w:val="15"/>
+                <w:vertAlign w:val="baseline"/>
+              </w:rPr>
+            </w:pPr>
+          </w:p>
+        </w:tc>
+        <w:tc>
+          <w:tcPr>
+            <w:tcW w:w="2130" w:type="dxa"/>
+          </w:tcPr>
+          <w:p>
+            <w:pPr>
+              <w:rPr>
+                <w:rFonts w:hint="default" w:ascii="Arial" w:hAnsi="Arial" w:cs="Arial"/>
+                <w:sz w:val="15"/>
+                <w:szCs w:val="15"/>
+                <w:vertAlign w:val="baseline"/>
+              </w:rPr>
+            </w:pPr>
+          </w:p>
+        </w:tc>
+      </w:tr>
+      <w:tr>
+        <w:tblPrEx>
+          <w:tblBorders>
+            <w:top w:val="single" w:color="auto" w:sz="4" w:space="0"/>
+            <w:left w:val="single" w:color="auto" w:sz="4" w:space="0"/>
+            <w:bottom w:val="single" w:color="auto" w:sz="4" w:space="0"/>
+            <w:right w:val="single" w:color="auto" w:sz="4" w:space="0"/>
+            <w:insideH w:val="single" w:color="auto" w:sz="4" w:space="0"/>
+            <w:insideV w:val="single" w:color="auto" w:sz="4" w:space="0"/>
+          </w:tblBorders>
+          <w:tblCellMar>
+            <w:top w:w="0" w:type="dxa"/>
+            <w:left w:w="108" w:type="dxa"/>
+            <w:bottom w:w="0" w:type="dxa"/>
+            <w:right w:w="108" w:type="dxa"/>
+          </w:tblCellMar>
+        </w:tblPrEx>
+        <w:tc>
+          <w:tcPr>
+            <w:tcW w:w="2129" w:type="dxa"/>
+          </w:tcPr>
+          <w:p>
+            <w:pPr>
+              <w:rPr>
+                <w:rFonts w:hint="default" w:ascii="Arial" w:hAnsi="Arial" w:cs="Arial"/>
+                <w:sz w:val="15"/>
+                <w:szCs w:val="15"/>
+                <w:vertAlign w:val="baseline"/>
+              </w:rPr>
+            </w:pPr>
+          </w:p>
+        </w:tc>
+        <w:tc>
+          <w:tcPr>
+            <w:tcW w:w="2130" w:type="dxa"/>
+          </w:tcPr>
+          <w:p>
+            <w:pPr>
+              <w:rPr>
+                <w:rFonts w:hint="default" w:ascii="Arial" w:hAnsi="Arial" w:cs="Arial"/>
+                <w:sz w:val="15"/>
+                <w:szCs w:val="15"/>
+                <w:vertAlign w:val="baseline"/>
+              </w:rPr>
+            </w:pPr>
+          </w:p>
+        </w:tc>
+        <w:tc>
+          <w:tcPr>
+            <w:tcW w:w="2130" w:type="dxa"/>
+          </w:tcPr>
+          <w:p>
+            <w:pPr>
+              <w:rPr>
+                <w:rFonts w:hint="default" w:ascii="Arial" w:hAnsi="Arial" w:cs="Arial"/>
+                <w:sz w:val="15"/>
+                <w:szCs w:val="15"/>
+                <w:vertAlign w:val="baseline"/>
+              </w:rPr>
+            </w:pPr>
+          </w:p>
+        </w:tc>
+        <w:tc>
+          <w:tcPr>
+            <w:tcW w:w="2130" w:type="dxa"/>
+          </w:tcPr>
+          <w:p>
+            <w:pPr>
+              <w:rPr>
+                <w:rFonts w:hint="default" w:ascii="Arial" w:hAnsi="Arial" w:cs="Arial"/>
+                <w:sz w:val="15"/>
+                <w:szCs w:val="15"/>
+                <w:vertAlign w:val="baseline"/>
+              </w:rPr>
+            </w:pPr>
+          </w:p>
+        </w:tc>
+      </w:tr>
+      <w:tr>
+        <w:tblPrEx>
+          <w:tblBorders>
+            <w:top w:val="single" w:color="auto" w:sz="4" w:space="0"/>
+            <w:left w:val="single" w:color="auto" w:sz="4" w:space="0"/>
+            <w:bottom w:val="single" w:color="auto" w:sz="4" w:space="0"/>
+            <w:right w:val="single" w:color="auto" w:sz="4" w:space="0"/>
+            <w:insideH w:val="single" w:color="auto" w:sz="4" w:space="0"/>
+            <w:insideV w:val="single" w:color="auto" w:sz="4" w:space="0"/>
+          </w:tblBorders>
+          <w:tblCellMar>
+            <w:top w:w="0" w:type="dxa"/>
+            <w:left w:w="108" w:type="dxa"/>
+            <w:bottom w:w="0" w:type="dxa"/>
+            <w:right w:w="108" w:type="dxa"/>
+          </w:tblCellMar>
+        </w:tblPrEx>
+        <w:tc>
+          <w:tcPr>
+            <w:tcW w:w="2129" w:type="dxa"/>
+          </w:tcPr>
+          <w:p>
+            <w:pPr>
+              <w:rPr>
+                <w:rFonts w:hint="default" w:ascii="Arial" w:hAnsi="Arial" w:cs="Arial"/>
+                <w:sz w:val="15"/>
+                <w:szCs w:val="15"/>
+                <w:vertAlign w:val="baseline"/>
+              </w:rPr>
+            </w:pPr>
+          </w:p>
+        </w:tc>
+        <w:tc>
+          <w:tcPr>
+            <w:tcW w:w="2130" w:type="dxa"/>
+          </w:tcPr>
+          <w:p>
+            <w:pPr>
+              <w:rPr>
+                <w:rFonts w:hint="default" w:ascii="Arial" w:hAnsi="Arial" w:cs="Arial"/>
+                <w:sz w:val="15"/>
+                <w:szCs w:val="15"/>
+                <w:vertAlign w:val="baseline"/>
+              </w:rPr>
+            </w:pPr>
+          </w:p>
+        </w:tc>
+        <w:tc>
+          <w:tcPr>
+            <w:tcW w:w="2130" w:type="dxa"/>
+          </w:tcPr>
+          <w:p>
+            <w:pPr>
+              <w:rPr>
+                <w:rFonts w:hint="default" w:ascii="Arial" w:hAnsi="Arial" w:cs="Arial"/>
+                <w:sz w:val="15"/>
+                <w:szCs w:val="15"/>
+                <w:vertAlign w:val="baseline"/>
+              </w:rPr>
+            </w:pPr>
+          </w:p>
+        </w:tc>
+        <w:tc>
+          <w:tcPr>
+            <w:tcW w:w="2130" w:type="dxa"/>
+          </w:tcPr>
+          <w:p>
+            <w:pPr>
+              <w:rPr>
+                <w:rFonts w:hint="default" w:ascii="Arial" w:hAnsi="Arial" w:cs="Arial"/>
+                <w:sz w:val="15"/>
+                <w:szCs w:val="15"/>
                 <w:vertAlign w:val="baseline"/>
               </w:rPr>
             </w:pPr>
@@ -568,10 +710,7 @@
         </w:tc>
       </w:tr>
     </w:tbl>
-    <w:p>
-      <w:bookmarkStart w:id="0" w:name="_GoBack"/>
-      <w:bookmarkEnd w:id="0"/>
-    </w:p>
+    <w:p/>
     <w:sectPr>
       <w:pgSz w:w="11906" w:h="16838"/>
       <w:pgMar w:top="1440" w:right="1800" w:bottom="1440" w:left="1800" w:header="851" w:footer="992" w:gutter="0"/>
@@ -658,7 +797,7 @@
     <w:lsdException w:qFormat="1" w:unhideWhenUsed="0" w:uiPriority="0" w:semiHidden="0" w:name="Title"/>
     <w:lsdException w:unhideWhenUsed="0" w:uiPriority="0" w:semiHidden="0" w:name="Closing"/>
     <w:lsdException w:unhideWhenUsed="0" w:uiPriority="0" w:semiHidden="0" w:name="Signature"/>
-    <w:lsdException w:unhideWhenUsed="0" w:uiPriority="0" w:name="Default Paragraph Font"/>
+    <w:lsdException w:qFormat="1" w:unhideWhenUsed="0" w:uiPriority="0" w:name="Default Paragraph Font"/>
     <w:lsdException w:unhideWhenUsed="0" w:uiPriority="0" w:semiHidden="0" w:name="Body Text"/>
     <w:lsdException w:unhideWhenUsed="0" w:uiPriority="0" w:semiHidden="0" w:name="Body Text Indent"/>
     <w:lsdException w:unhideWhenUsed="0" w:uiPriority="0" w:semiHidden="0" w:name="List Continue"/>
@@ -861,6 +1000,7 @@
   <w:style w:type="character" w:default="1" w:styleId="4">
     <w:name w:val="Default Paragraph Font"/>
     <w:semiHidden/>
+    <w:qFormat/>
     <w:uiPriority w:val="0"/>
   </w:style>
   <w:style w:type="table" w:default="1" w:styleId="2">

</xml_diff>